<commit_message>
v6.5: add loneliness sub-layer, closing the catalogue audit's one clean gap (Cacioppo & Patrick 2008)
</commit_message>
<xml_diff>
--- a/BAF_Questionnaire.docx
+++ b/BAF_Questionnaire.docx
@@ -165,7 +165,7 @@
         <w:spacing w:after="100"/>
       </w:pPr>
       <w:r>
-        <w:t xml:space="preserve">47 sub-layers, 94 micro-indicators, across 9 layers.</w:t>
+        <w:t xml:space="preserve">48 sub-layers, 96 micro-indicators, across 9 layers.</w:t>
       </w:r>
     </w:p>
     <w:p>
@@ -1865,6 +1865,79 @@
       </w:pPr>
       <w:r>
         <w:t xml:space="preserve">   "Being excluded or rejected by others affects me more intensely than I'd expect"</w:t>
+      </w:r>
+    </w:p>
+    <w:p>
+      <w:pPr>
+        <w:spacing w:after="100"/>
+      </w:pPr>
+      <w:r>
+        <w:t xml:space="preserve">   1 = Strongly disagree   2 = Disagree   3 = Neutral   4 = Agree   5 = Strongly agree</w:t>
+      </w:r>
+    </w:p>
+    <w:p>
+      <w:pPr>
+        <w:pStyle w:val="Heading3"/>
+        <w:spacing w:after="120" w:before="240"/>
+      </w:pPr>
+      <w:r>
+        <w:t xml:space="preserve">Loneliness / social isolation (v6.5 -- MODERATE-HIGH tier ceiling 1.25, Cacioppo &amp; Patrick 2008; no confidence-multiplier adjustment -- large physiological/health-mechanism evidence base (cortisol, IL-6 inflammation, HPA-axis, cognitive decline) but no single quantifiable behavioral effect size analogous to Milgram/Asch, see Architecture 3.2b.1 Domain 2 / 3.2b.6. SC direction: positive -- follows the established Domain 4 pattern (social_comparison/social_exclusion above), where heightened social-threat salience raises social-calibration/hypervigilance rather than lowering it; read as conformity-seeking-under-isolation, not reduced social attunement  [id: loneliness]</w:t>
+      </w:r>
+    </w:p>
+    <w:p>
+      <w:pPr>
+        <w:spacing w:after="100"/>
+      </w:pPr>
+      <w:r>
+        <w:rPr>
+          <w:i/>
+          <w:iCs/>
+        </w:rPr>
+        <w:t xml:space="preserve">Categorical — pick one:  [id: loneliness_pick]</w:t>
+      </w:r>
+    </w:p>
+    <w:p>
+      <w:pPr>
+        <w:spacing w:after="100"/>
+      </w:pPr>
+      <w:r>
+        <w:t xml:space="preserve">   A. Rarely feels lonely / feels socially connected</w:t>
+      </w:r>
+    </w:p>
+    <w:p>
+      <w:pPr>
+        <w:spacing w:after="100"/>
+      </w:pPr>
+      <w:r>
+        <w:t xml:space="preserve">   B. Occasional feelings of loneliness</w:t>
+      </w:r>
+    </w:p>
+    <w:p>
+      <w:pPr>
+        <w:spacing w:after="100"/>
+      </w:pPr>
+      <w:r>
+        <w:t xml:space="preserve">   C. Persistent, significant loneliness / social isolation</w:t>
+      </w:r>
+    </w:p>
+    <w:p>
+      <w:pPr>
+        <w:spacing w:after="100"/>
+      </w:pPr>
+      <w:r>
+        <w:rPr>
+          <w:i/>
+          <w:iCs/>
+        </w:rPr>
+        <w:t xml:space="preserve">Self-report statement (1–5):  [id: loneliness_slider]</w:t>
+      </w:r>
+    </w:p>
+    <w:p>
+      <w:pPr>
+        <w:spacing w:after="100"/>
+      </w:pPr>
+      <w:r>
+        <w:t xml:space="preserve">   "I feel isolated or disconnected from others, even when people are around"</w:t>
       </w:r>
     </w:p>
     <w:p>

</xml_diff>